<commit_message>
Create Power BI report
</commit_message>
<xml_diff>
--- a/01 Generate Word Report/SVSD Report.docx
+++ b/01 Generate Word Report/SVSD Report.docx
@@ -367,7 +367,23 @@
           <w:rFonts w:ascii="Aptos Display" w:hAnsi="Aptos Display"/>
           <w:color w:val="000000" w:themeColor="text1"/>
         </w:rPr>
-        <w:t xml:space="preserve"> and CoAlt students are included if they took the diagnostic.</w:t>
+        <w:t xml:space="preserve"> and </w:t>
+      </w:r>
+      <w:proofErr w:type="spellStart"/>
+      <w:r>
+        <w:rPr>
+          <w:rFonts w:ascii="Aptos Display" w:hAnsi="Aptos Display"/>
+          <w:color w:val="000000" w:themeColor="text1"/>
+        </w:rPr>
+        <w:t>CoAlt</w:t>
+      </w:r>
+      <w:proofErr w:type="spellEnd"/>
+      <w:r>
+        <w:rPr>
+          <w:rFonts w:ascii="Aptos Display" w:hAnsi="Aptos Display"/>
+          <w:color w:val="000000" w:themeColor="text1"/>
+        </w:rPr>
+        <w:t xml:space="preserve"> students are included if they took the diagnostic.</w:t>
       </w:r>
     </w:p>
     <w:tbl>
@@ -11818,7 +11834,7 @@
                 <w:rFonts w:ascii="Aptos Display" w:hAnsi="Aptos Display"/>
                 <w:b/>
                 <w:bCs/>
-                <w:color w:val="156082" w:themeColor="accent1"/>
+                <w:color w:val="000000" w:themeColor="text1"/>
               </w:rPr>
               <w:t>55%</w:t>
             </w:r>

</xml_diff>